<commit_message>
Draft Chapter 20 (Barber); enrich Chapter 19 (Jensen) with the murder syllabus
- ch20 'He Researched the Wound Before He Made It': Barber's wholly
  circumstantial beach murder of his wife for a M policy; the pre-murder
  computer searches. Anchored to the opinion (water's-edge shooting,
  premeditation/pecuniary gain, admitted affairs/insurance/searches); the
  specific search terms + his four wounds flagged as trial-record/reporting.
- ch19 Jensen: added 'The murder syllabus' section from newly-pulled
  Jensen II (2011 WI App 3) - home-computer searches for botulism, mercury
  fulminate, pipe bombs, poisoning, and a 7:40 a.m. 'ethylene glycol
  poisoning' search the morning Julie died; cross-referenced to Ch. 8
  (Turner). Chapter now fully at home in the 'What You Typed' part.
- Master now 32 chapters + interlude. Parts II and III essentially complete.

Co-Authored-By: Claude Opus 4.8 <noreply@anthropic.com>
Claude-Session: https://claude.ai/code/session_016HAHAXcMmaZghEz1kJrDWU
</commit_message>
<xml_diff>
--- a/book/word/Chapter 19 - The Letter From the Grave.docx
+++ b/book/word/Chapter 19 - The Letter From the Grave.docx
@@ -2,7 +2,7 @@
 <file path=word/document.xml><?xml version="1.0" encoding="utf-8"?>
 <w:document xmlns:w="http://schemas.openxmlformats.org/wordprocessingml/2006/main" xmlns:m="http://schemas.openxmlformats.org/officeDocument/2006/math" xmlns:r="http://schemas.openxmlformats.org/officeDocument/2006/relationships" xmlns:o="urn:schemas-microsoft-com:office:office" xmlns:v="urn:schemas-microsoft-com:vml" xmlns:w10="urn:schemas-microsoft-com:office:word" xmlns:a="http://schemas.openxmlformats.org/drawingml/2006/main" xmlns:pic="http://schemas.openxmlformats.org/drawingml/2006/picture" xmlns:wp="http://schemas.openxmlformats.org/drawingml/2006/wordprocessingDrawing">
   <w:body>
-    <w:bookmarkStart w:id="25" w:name="chapter-19---the-letter-from-the-grave"/>
+    <w:bookmarkStart w:id="26" w:name="chapter-19---the-letter-from-the-grave"/>
     <w:p>
       <w:pPr>
         <w:pStyle w:val="Heading1"/>
@@ -220,6 +220,192 @@
         <w:t xml:space="preserve">from beyond her own funeral.</w:t>
       </w:r>
     </w:p>
+    <w:bookmarkEnd w:id="20"/>
+    <w:bookmarkStart w:id="21" w:name="the-murder-syllabus"/>
+    <w:p>
+      <w:pPr>
+        <w:pStyle w:val="Heading2"/>
+      </w:pPr>
+      <w:r>
+        <w:t xml:space="preserve">The murder syllabus</w:t>
+      </w:r>
+    </w:p>
+    <w:p>
+      <w:pPr>
+        <w:pStyle w:val="FirstParagraph"/>
+      </w:pPr>
+      <w:r>
+        <w:t xml:space="preserve">Before we follow the letter on its long journey through the courts, it is worth</w:t>
+      </w:r>
+      <w:r>
+        <w:t xml:space="preserve"> </w:t>
+      </w:r>
+      <w:r>
+        <w:t xml:space="preserve">knowing why the police were so sure Julie’s accusation was right, because the</w:t>
+      </w:r>
+      <w:r>
+        <w:t xml:space="preserve"> </w:t>
+      </w:r>
+      <w:r>
+        <w:t xml:space="preserve">answer sat on the family computer, and it reads like a curriculum in how to kill</w:t>
+      </w:r>
+      <w:r>
+        <w:t xml:space="preserve"> </w:t>
+      </w:r>
+      <w:r>
+        <w:t xml:space="preserve">your wife.</w:t>
+      </w:r>
+    </w:p>
+    <w:p>
+      <w:pPr>
+        <w:pStyle w:val="BodyText"/>
+      </w:pPr>
+      <w:r>
+        <w:t xml:space="preserve">Julie Jensen died of ethylene-glycol poisoning, the sweet, toxic core of</w:t>
+      </w:r>
+      <w:r>
+        <w:t xml:space="preserve"> </w:t>
+      </w:r>
+      <w:r>
+        <w:t xml:space="preserve">antifreeze that we met in Chapter 8. And in the months before her death, as the</w:t>
+      </w:r>
+      <w:r>
+        <w:t xml:space="preserve"> </w:t>
+      </w:r>
+      <w:r>
+        <w:t xml:space="preserve">appellate record lays out, the Jensen home computer had gone looking for exactly</w:t>
+      </w:r>
+      <w:r>
+        <w:t xml:space="preserve"> </w:t>
+      </w:r>
+      <w:r>
+        <w:t xml:space="preserve">that kind of knowledge. Its internet history held searches for botulism,</w:t>
+      </w:r>
+      <w:r>
+        <w:t xml:space="preserve"> </w:t>
+      </w:r>
+      <w:r>
+        <w:t xml:space="preserve">poisoning, mercury fulminate, and pipe bombs. A website had been visited on how</w:t>
+      </w:r>
+      <w:r>
+        <w:t xml:space="preserve"> </w:t>
+      </w:r>
+      <w:r>
+        <w:t xml:space="preserve">to reverse the polarity of a battery. There were, tellingly, no searches on the</w:t>
+      </w:r>
+      <w:r>
+        <w:t xml:space="preserve"> </w:t>
+      </w:r>
+      <w:r>
+        <w:t xml:space="preserve">things an innocent man in a failing marriage might look up, nothing about</w:t>
+      </w:r>
+      <w:r>
+        <w:t xml:space="preserve"> </w:t>
+      </w:r>
+      <w:r>
+        <w:t xml:space="preserve">separation or divorce, only about ways to make a person die. And on the morning</w:t>
+      </w:r>
+      <w:r>
+        <w:t xml:space="preserve"> </w:t>
+      </w:r>
+      <w:r>
+        <w:t xml:space="preserve">of Julie’s death itself, the computer recorded a search, logged at 7:40 a.m., for</w:t>
+      </w:r>
+      <w:r>
+        <w:t xml:space="preserve"> </w:t>
+      </w:r>
+      <w:r>
+        <w:t xml:space="preserve">“</w:t>
+      </w:r>
+      <w:r>
+        <w:t xml:space="preserve">ethylene glycol poisoning,</w:t>
+      </w:r>
+      <w:r>
+        <w:t xml:space="preserve">”</w:t>
+      </w:r>
+      <w:r>
+        <w:t xml:space="preserve"> </w:t>
+      </w:r>
+      <w:r>
+        <w:t xml:space="preserve">the precise poison that would kill her.</w:t>
+      </w:r>
+    </w:p>
+    <w:p>
+      <w:pPr>
+        <w:pStyle w:val="BodyText"/>
+      </w:pPr>
+      <w:r>
+        <w:t xml:space="preserve">It was not only the machine that testified. A witness recounted that Julie,</w:t>
+      </w:r>
+      <w:r>
+        <w:t xml:space="preserve"> </w:t>
+      </w:r>
+      <w:r>
+        <w:t xml:space="preserve">frightened, had shown him sticky notes she’d found,</w:t>
+      </w:r>
+      <w:r>
+        <w:t xml:space="preserve"> </w:t>
+      </w:r>
+      <w:r>
+        <w:t xml:space="preserve">“</w:t>
+      </w:r>
+      <w:r>
+        <w:t xml:space="preserve">different poisoning sites for</w:t>
+      </w:r>
+      <w:r>
+        <w:t xml:space="preserve"> </w:t>
+      </w:r>
+      <w:r>
+        <w:t xml:space="preserve">different poison,</w:t>
+      </w:r>
+      <w:r>
+        <w:t xml:space="preserve">”</w:t>
+      </w:r>
+      <w:r>
+        <w:t xml:space="preserve"> </w:t>
+      </w:r>
+      <w:r>
+        <w:t xml:space="preserve">and a poisoning website left open on her husband’s computer</w:t>
+      </w:r>
+      <w:r>
+        <w:t xml:space="preserve"> </w:t>
+      </w:r>
+      <w:r>
+        <w:t xml:space="preserve">screen. She had been advised to take pictures of it. The woman who wrote the</w:t>
+      </w:r>
+      <w:r>
+        <w:t xml:space="preserve"> </w:t>
+      </w:r>
+      <w:r>
+        <w:t xml:space="preserve">letter and left the voicemails was not imagining her danger. She had watched it</w:t>
+      </w:r>
+      <w:r>
+        <w:t xml:space="preserve"> </w:t>
+      </w:r>
+      <w:r>
+        <w:t xml:space="preserve">being researched.</w:t>
+      </w:r>
+    </w:p>
+    <w:p>
+      <w:pPr>
+        <w:pStyle w:val="BodyText"/>
+      </w:pPr>
+      <w:r>
+        <w:t xml:space="preserve">That is the evidence that made everyone certain. But certainty is not the same as</w:t>
+      </w:r>
+      <w:r>
+        <w:t xml:space="preserve"> </w:t>
+      </w:r>
+      <w:r>
+        <w:t xml:space="preserve">admissibility, and the fight that consumed the next two decades was not about the</w:t>
+      </w:r>
+      <w:r>
+        <w:t xml:space="preserve"> </w:t>
+      </w:r>
+      <w:r>
+        <w:t xml:space="preserve">searches on the computer. It was about the words in Julie’s letter.</w:t>
+      </w:r>
+    </w:p>
     <w:p>
       <w:pPr>
         <w:pStyle w:val="BodyText"/>
@@ -642,8 +828,8 @@
         <w:t xml:space="preserve">first place.</w:t>
       </w:r>
     </w:p>
-    <w:bookmarkEnd w:id="20"/>
-    <w:bookmarkStart w:id="21" w:name="the-epilogue-the-opinion-cant-give-you"/>
+    <w:bookmarkEnd w:id="21"/>
+    <w:bookmarkStart w:id="22" w:name="the-epilogue-the-opinion-cant-give-you"/>
     <w:p>
       <w:pPr>
         <w:pStyle w:val="Heading2"/>
@@ -732,8 +918,8 @@
         <w:t xml:space="preserve">confirm the current status before print.)</w:t>
       </w:r>
     </w:p>
-    <w:bookmarkEnd w:id="21"/>
-    <w:bookmarkStart w:id="24" w:name="howd-he-get-caught"/>
+    <w:bookmarkEnd w:id="22"/>
+    <w:bookmarkStart w:id="25" w:name="howd-he-get-caught"/>
     <w:p>
       <w:pPr>
         <w:pStyle w:val="Heading2"/>
@@ -880,7 +1066,7 @@
       <w:r>
         <w:t xml:space="preserve"> </w:t>
       </w:r>
-      <w:hyperlink r:id="rId22">
+      <w:hyperlink r:id="rId23">
         <w:r>
           <w:rPr>
             <w:rStyle w:val="Hyperlink"/>
@@ -897,7 +1083,7 @@
       <w:r>
         <w:t xml:space="preserve"> </w:t>
       </w:r>
-      <w:hyperlink r:id="rId23">
+      <w:hyperlink r:id="rId24">
         <w:r>
           <w:rPr>
             <w:rStyle w:val="Hyperlink"/>
@@ -950,7 +1136,7 @@
           <w:bCs/>
           <w:b/>
         </w:rPr>
-        <w:t xml:space="preserve">Companion authority (for the underlying trial evidence, incl. the family</w:t>
+        <w:t xml:space="preserve">Companion authority (source for</w:t>
       </w:r>
       <w:r>
         <w:rPr>
@@ -964,7 +1150,105 @@
           <w:bCs/>
           <w:b/>
         </w:rPr>
-        <w:t xml:space="preserve">computer forensics):</w:t>
+        <w:t xml:space="preserve">“</w:t>
+      </w:r>
+      <w:r>
+        <w:rPr>
+          <w:bCs/>
+          <w:b/>
+        </w:rPr>
+        <w:t xml:space="preserve">The murder syllabus</w:t>
+      </w:r>
+      <w:r>
+        <w:rPr>
+          <w:bCs/>
+          <w:b/>
+        </w:rPr>
+        <w:t xml:space="preserve">”</w:t>
+      </w:r>
+      <w:r>
+        <w:rPr>
+          <w:bCs/>
+          <w:b/>
+        </w:rPr>
+        <w:t xml:space="preserve"> </w:t>
+      </w:r>
+      <w:r>
+        <w:rPr>
+          <w:bCs/>
+          <w:b/>
+        </w:rPr>
+        <w:t xml:space="preserve">section above - the</w:t>
+      </w:r>
+      <w:r>
+        <w:rPr>
+          <w:bCs/>
+          <w:b/>
+        </w:rPr>
+        <w:t xml:space="preserve"> </w:t>
+      </w:r>
+      <w:r>
+        <w:rPr>
+          <w:bCs/>
+          <w:b/>
+        </w:rPr>
+        <w:t xml:space="preserve">home-computer searches for botulism, mercury fulminate, pipe bombs, and the</w:t>
+      </w:r>
+      <w:r>
+        <w:rPr>
+          <w:bCs/>
+          <w:b/>
+        </w:rPr>
+        <w:t xml:space="preserve"> </w:t>
+      </w:r>
+      <w:r>
+        <w:rPr>
+          <w:bCs/>
+          <w:b/>
+        </w:rPr>
+        <w:t xml:space="preserve">7:40 a.m.</w:t>
+      </w:r>
+      <w:r>
+        <w:rPr>
+          <w:bCs/>
+          <w:b/>
+        </w:rPr>
+        <w:t xml:space="preserve"> </w:t>
+      </w:r>
+      <w:r>
+        <w:rPr>
+          <w:bCs/>
+          <w:b/>
+        </w:rPr>
+        <w:t xml:space="preserve">“</w:t>
+      </w:r>
+      <w:r>
+        <w:rPr>
+          <w:bCs/>
+          <w:b/>
+        </w:rPr>
+        <w:t xml:space="preserve">ethylene glycol poisoning</w:t>
+      </w:r>
+      <w:r>
+        <w:rPr>
+          <w:bCs/>
+          <w:b/>
+        </w:rPr>
+        <w:t xml:space="preserve">”</w:t>
+      </w:r>
+      <w:r>
+        <w:rPr>
+          <w:bCs/>
+          <w:b/>
+        </w:rPr>
+        <w:t xml:space="preserve"> </w:t>
+      </w:r>
+      <w:r>
+        <w:rPr>
+          <w:bCs/>
+          <w:b/>
+        </w:rPr>
+        <w:t xml:space="preserve">search the morning Julie died):</w:t>
       </w:r>
       <w:r>
         <w:t xml:space="preserve"> </w:t>
@@ -974,20 +1258,66 @@
           <w:iCs/>
           <w:i/>
         </w:rPr>
-        <w:t xml:space="preserve">State v. Jensen</w:t>
-      </w:r>
-      <w:r>
-        <w:t xml:space="preserve">, 2011 WI App 3, 331 Wis. 2d 440 -</w:t>
-      </w:r>
-      <w:r>
-        <w:t xml:space="preserve"> </w:t>
-      </w:r>
-      <w:r>
-        <w:t xml:space="preserve">on the pull list.</w:t>
-      </w:r>
-    </w:p>
-    <w:bookmarkEnd w:id="24"/>
+        <w:t xml:space="preserve">State</w:t>
+      </w:r>
+      <w:r>
+        <w:rPr>
+          <w:iCs/>
+          <w:i/>
+        </w:rPr>
+        <w:t xml:space="preserve"> </w:t>
+      </w:r>
+      <w:r>
+        <w:rPr>
+          <w:iCs/>
+          <w:i/>
+        </w:rPr>
+        <w:t xml:space="preserve">v. Jensen</w:t>
+      </w:r>
+      <w:r>
+        <w:t xml:space="preserve">, 2011 WI App 3, 331 Wis. 2d 440, 794 N.W.2d 482 (affirming the</w:t>
+      </w:r>
+      <w:r>
+        <w:t xml:space="preserve"> </w:t>
+      </w:r>
+      <w:r>
+        <w:t xml:space="preserve">conviction).</w:t>
+      </w:r>
+      <w:r>
+        <w:t xml:space="preserve"> </w:t>
+      </w:r>
+      <w:r>
+        <w:rPr>
+          <w:bCs/>
+          <w:b/>
+        </w:rPr>
+        <w:t xml:space="preserve">See also</w:t>
+      </w:r>
+      <w:r>
+        <w:t xml:space="preserve"> </w:t>
+      </w:r>
+      <w:r>
+        <w:t xml:space="preserve">Chapter 8 (</w:t>
+      </w:r>
+      <w:r>
+        <w:rPr>
+          <w:iCs/>
+          <w:i/>
+        </w:rPr>
+        <w:t xml:space="preserve">Turner</w:t>
+      </w:r>
+      <w:r>
+        <w:t xml:space="preserve">), the other ethylene-glycol poisoning in this</w:t>
+      </w:r>
+      <w:r>
+        <w:t xml:space="preserve"> </w:t>
+      </w:r>
+      <w:r>
+        <w:t xml:space="preserve">book.</w:t>
+      </w:r>
+    </w:p>
     <w:bookmarkEnd w:id="25"/>
+    <w:bookmarkEnd w:id="26"/>
     <w:sectPr/>
   </w:body>
 </w:document>

</xml_diff>